<commit_message>
Rick e Renner: revisão da Parte 2
Co-Authored-By: Claude Opus 5.5 <noreply@anthropic.com>
Claude-Session: https://claude.ai/code/session_01MJjUEEZrxQDEUifKK2vj9g
</commit_message>
<xml_diff>
--- a/roteiros/rick-e-renner/RickRenner_Parte2.docx
+++ b/roteiros/rick-e-renner/RickRenner_Parte2.docx
@@ -63,7 +63,7 @@
         <w:rPr>
           <w:color w:val="000000"/>
         </w:rPr>
-        <w:t>Rick e Renner foram parar nos programas de maior audiência do país. Cantaram até no "Planeta Xuxa", diante de um auditório lotado de crianças.</w:t>
+        <w:t>Rick e Renner foram parar nos programas de maior audiência do país. Cantaram até no "Planeta Xuxa", um dos programas mais vistos da época.</w:t>
       </w:r>
     </w:p>
     <w:p>
@@ -279,15 +279,7 @@
         <w:rPr>
           <w:color w:val="000000"/>
         </w:rPr>
-        <w:t>Ao longo da carreira, os dois iam vender mais de quinze milhões de discos.</w:t>
-      </w:r>
-    </w:p>
-    <w:p>
-      <w:r>
-        <w:rPr>
-          <w:color w:val="000000"/>
-        </w:rPr>
-        <w:t>Só que o dinheiro e a fama chegaram quando Renner ainda era muito jovem.</w:t>
+        <w:t>Ao longo da carreira, os dois iam vender mais de dez milhões de discos.</w:t>
       </w:r>
     </w:p>
     <w:p>

</xml_diff>

<commit_message>
Rick e Renner: amplia roteiro com material verificado
Co-Authored-By: Claude Opus 5.5 <noreply@anthropic.com>
Claude-Session: https://claude.ai/code/session_01MJjUEEZrxQDEUifKK2vj9g
</commit_message>
<xml_diff>
--- a/roteiros/rick-e-renner/RickRenner_Parte2.docx
+++ b/roteiros/rick-e-renner/RickRenner_Parte2.docx
@@ -255,7 +255,7 @@
         <w:rPr>
           <w:color w:val="C00000"/>
         </w:rPr>
-        <w:t>Guarde essa música. Porque "Filha" ia acompanhar Rick até o fim. Literalmente. Vinte e cinco anos depois, ela seria a última música que ele cantaria antes de entrar naquele helicóptero.</w:t>
+        <w:t>E "Filha" ia acompanhar Rick até o fim. Literalmente. Vinte e cinco anos depois, ela seria a última música que ele cantaria antes de entrar naquele helicóptero.</w:t>
       </w:r>
     </w:p>
     <w:p>
@@ -271,7 +271,7 @@
         <w:rPr>
           <w:color w:val="000000"/>
         </w:rPr>
-        <w:t>Discos vendendo como nunca. Agenda lotada. Rick compondo para outros artistas. Renner, com menos de trinta anos, vivendo o sonho que tinha começado no rock dos bares de Brasília.</w:t>
+        <w:t>Discos vendendo como nunca. Agenda lotada. Rick compondo para outros artistas. Chitãozinho e Xororó, por exemplo, gravaram duas músicas dele, "Página de Amigos" e "Eu Menti". Renner, com menos de trinta anos, vivendo o sonho que tinha começado no rock dos bares de Brasília.</w:t>
       </w:r>
     </w:p>
     <w:p>

</xml_diff>